<commit_message>
1ª versão: Concorrências habilitadas dentro do Measure Takeoff (mandar e receber, de qualquer empresa para qualquer empresa) e Obras simplificada (sem diário, ponto nem cronograma) para poder fechar; guia da edição com as Concorrências
Co-Authored-By: Claude Sonnet 5.5 <noreply@anthropic.com>
Claude-Session: https://claude.ai/code/session_01Ep8bJsuQq2bqGePCMzzux2
</commit_message>
<xml_diff>
--- a/portal-measure/files/KORbuild Settings - Overview.docx
+++ b/portal-measure/files/KORbuild Settings - Overview.docx
@@ -145,6 +145,40 @@
                 <w:sz w:val="18"/>
               </w:rPr>
               <w:t>Name, legal name, address, phone, logo and the details that appear on proposals.</w:t>
+            </w:r>
+          </w:p>
+        </w:tc>
+      </w:tr>
+      <w:tr>
+        <w:tc>
+          <w:tcPr>
+            <w:tcW w:type="dxa" w:w="4873"/>
+          </w:tcPr>
+          <w:p>
+            <w:r/>
+            <w:r>
+              <w:rPr>
+                <w:b/>
+                <w:i w:val="0"/>
+                <w:sz w:val="18"/>
+              </w:rPr>
+              <w:t>Jobs</w:t>
+            </w:r>
+          </w:p>
+        </w:tc>
+        <w:tc>
+          <w:tcPr>
+            <w:tcW w:type="dxa" w:w="4873"/>
+          </w:tcPr>
+          <w:p>
+            <w:r/>
+            <w:r>
+              <w:rPr>
+                <w:b w:val="0"/>
+                <w:i w:val="0"/>
+                <w:sz w:val="18"/>
+              </w:rPr>
+              <w:t>One entry per job. Needed to close a bid: the company that wins creates its job from the won project, already linked to the contracting company's job.</w:t>
             </w:r>
           </w:p>
         </w:tc>

</xml_diff>